<commit_message>
Latest code/prompt changes for the chatbot. Need to continue working on testing the bot and adjusting the prompt. Code should be solid now until I get to some small bugs & changes I want to make.
</commit_message>
<xml_diff>
--- a/CorporatePortfolio/DavidTurner_Resume.docx
+++ b/CorporatePortfolio/DavidTurner_Resume.docx
@@ -10,6 +10,7 @@
           <w:szCs w:val="32"/>
         </w:rPr>
       </w:pPr>
+      <w:bookmarkStart w:id="0" w:name="ContactInfo"/>
       <w:r>
         <w:rPr>
           <w:sz w:val="36"/>
@@ -41,6 +42,7 @@
           <w:t>dave.w.turner@outlook.com</w:t>
         </w:r>
       </w:hyperlink>
+      <w:bookmarkEnd w:id="0"/>
     </w:p>
     <w:p/>
     <w:p>
@@ -53,9 +55,11 @@
       </w:r>
     </w:p>
     <w:p>
+      <w:bookmarkStart w:id="1" w:name="Summary"/>
       <w:r>
         <w:t>Seasoned Senior Software Developer with extensive experience delivering enterprise-grade applications, spearheading DevOps automation, and providing technical mentorship to development teams. Over 10 years of full-stack expertise, complemented by a decade of independent project work, with a strong track record in architecting scalable, high-performance solutions leveraging C# .NET, Azure, and modern JavaScript frameworks in Agile environments.</w:t>
       </w:r>
+      <w:bookmarkEnd w:id="1"/>
     </w:p>
     <w:p/>
     <w:p>
@@ -76,102 +80,15 @@
         </w:tabs>
         <w:ind w:left="426"/>
       </w:pPr>
+      <w:bookmarkStart w:id="2" w:name="Competencies"/>
       <w:r>
-        <w:t>Development Practices: Agile/Scrum, TDD, SDLC, Code Reviews, Peer Mentoring, Generative AI (Azure AI Vision)</w:t>
+        <w:t>Core Tech: C# .NET Core</w:t>
       </w:r>
       <w:r>
-        <w:t>, Design Patterns</w:t>
-      </w:r>
-    </w:p>
-    <w:p>
-      <w:pPr>
-        <w:pStyle w:val="ListBullet"/>
-        <w:ind w:left="426"/>
-      </w:pPr>
-      <w:r>
-        <w:t xml:space="preserve">Tools &amp; Platforms: Visual Studio, SmartSimple CRM, CRM Dynamics, NuGet, Git, Slack Bots, </w:t>
+        <w:t xml:space="preserve">, SQL, </w:t>
       </w:r>
       <w:r>
-        <w:t xml:space="preserve">Active Directory, </w:t>
-      </w:r>
-      <w:r>
-        <w:t>ADFS, SCCM</w:t>
-      </w:r>
-    </w:p>
-    <w:p>
-      <w:pPr>
-        <w:pStyle w:val="ListBullet"/>
-        <w:ind w:left="426"/>
-      </w:pPr>
-      <w:r>
-        <w:t xml:space="preserve">Testing &amp; Automation: </w:t>
-      </w:r>
-      <w:proofErr w:type="spellStart"/>
-      <w:r>
-        <w:t>NUnit</w:t>
-      </w:r>
-      <w:proofErr w:type="spellEnd"/>
-      <w:r>
-        <w:t xml:space="preserve">, </w:t>
-      </w:r>
-      <w:proofErr w:type="spellStart"/>
-      <w:r>
-        <w:t>XUnit</w:t>
-      </w:r>
-      <w:proofErr w:type="spellEnd"/>
-      <w:r>
-        <w:t>, MS Test, Selenium, PowerShell Scripting</w:t>
-      </w:r>
-    </w:p>
-    <w:p>
-      <w:pPr>
-        <w:pStyle w:val="ListBullet"/>
-        <w:ind w:left="426"/>
-      </w:pPr>
-      <w:r>
-        <w:t>Frontend: Kendo UI, jQuery, Dynamic Form Rendering, Responsive UI</w:t>
-      </w:r>
-      <w:r>
-        <w:t xml:space="preserve">, </w:t>
-      </w:r>
-    </w:p>
-    <w:p>
-      <w:pPr>
-        <w:pStyle w:val="ListBullet"/>
-        <w:ind w:left="426"/>
-      </w:pPr>
-      <w:r>
-        <w:t>Backend &amp; APIs: RESTful Services, SOAP, WCF, Entity Framework, SQL Server</w:t>
-      </w:r>
-    </w:p>
-    <w:p>
-      <w:pPr>
-        <w:pStyle w:val="ListBullet"/>
-        <w:ind w:left="426"/>
-      </w:pPr>
-      <w:r>
-        <w:t>Cloud &amp; DevOps Tools: Azure (App Services, SQL, AD, VMs, Networking), Azure DevOps, YAML Pipelines, CI/CD, TFS/VSO</w:t>
-      </w:r>
-    </w:p>
-    <w:p>
-      <w:pPr>
-        <w:pStyle w:val="ListBullet"/>
-        <w:ind w:left="426"/>
-      </w:pPr>
-      <w:r>
-        <w:t>Languages &amp; Frameworks: C# .NET Core, ASP.NET MVC, WPF (MVVM), JavaScript, TypeScript, AngularJS,</w:t>
-      </w:r>
-      <w:r>
-        <w:t xml:space="preserve"> Angular </w:t>
-      </w:r>
-      <w:r>
-        <w:t>20,</w:t>
-      </w:r>
-      <w:r>
-        <w:t xml:space="preserve"> Razor, HTML/CSS</w:t>
-      </w:r>
-      <w:r>
-        <w:t xml:space="preserve">, </w:t>
+        <w:t xml:space="preserve">TypeScript, ASP.NET Core, MVC, Entity Framework, Angular, </w:t>
       </w:r>
       <w:proofErr w:type="spellStart"/>
       <w:r>
@@ -182,12 +99,70 @@
     <w:p>
       <w:pPr>
         <w:pStyle w:val="ListBullet"/>
-        <w:numPr>
-          <w:ilvl w:val="0"/>
-          <w:numId w:val="0"/>
-        </w:numPr>
-        <w:ind w:left="360"/>
-      </w:pPr>
+        <w:tabs>
+          <w:tab w:val="clear" w:pos="7448"/>
+          <w:tab w:val="num" w:pos="7088"/>
+        </w:tabs>
+        <w:ind w:left="426"/>
+      </w:pPr>
+      <w:r>
+        <w:t>Azure &amp; DevOps</w:t>
+      </w:r>
+      <w:r>
+        <w:t xml:space="preserve">: </w:t>
+      </w:r>
+      <w:r>
+        <w:t>App Services, Azure SQL, Azure DevOps (YAML Pipelines, CI/CD), AD, Generative AI (Azure AI Vision), Git, NuGet</w:t>
+      </w:r>
+    </w:p>
+    <w:p>
+      <w:pPr>
+        <w:pStyle w:val="ListBullet"/>
+        <w:tabs>
+          <w:tab w:val="clear" w:pos="7448"/>
+          <w:tab w:val="num" w:pos="7088"/>
+        </w:tabs>
+        <w:ind w:left="426"/>
+      </w:pPr>
+      <w:r>
+        <w:t xml:space="preserve">Enterprise &amp; Tools: </w:t>
+      </w:r>
+      <w:r>
+        <w:t xml:space="preserve">SmartSimple CRM, CRM Dynamics, Active Directory, ADFS, SCCM, Visual Studio, Selenium, </w:t>
+      </w:r>
+      <w:proofErr w:type="spellStart"/>
+      <w:r>
+        <w:t>xUnit</w:t>
+      </w:r>
+      <w:proofErr w:type="spellEnd"/>
+      <w:r>
+        <w:t>/</w:t>
+      </w:r>
+      <w:proofErr w:type="spellStart"/>
+      <w:r>
+        <w:t>nUnit</w:t>
+      </w:r>
+      <w:proofErr w:type="spellEnd"/>
+      <w:r>
+        <w:t>, MS Test</w:t>
+      </w:r>
+    </w:p>
+    <w:p>
+      <w:pPr>
+        <w:pStyle w:val="ListBullet"/>
+        <w:tabs>
+          <w:tab w:val="clear" w:pos="7448"/>
+          <w:tab w:val="num" w:pos="7088"/>
+        </w:tabs>
+        <w:ind w:left="426"/>
+      </w:pPr>
+      <w:r>
+        <w:t xml:space="preserve">Practices &amp; UI: </w:t>
+      </w:r>
+      <w:r>
+        <w:t>Agile/Scrum, TDD, SDLC, Code Reviews, Design Patterns, Kendo UI, jQuery, Responsive UI</w:t>
+      </w:r>
+      <w:bookmarkEnd w:id="2"/>
     </w:p>
     <w:p>
       <w:pPr>
@@ -207,6 +182,7 @@
           <w:iCs/>
         </w:rPr>
       </w:pPr>
+      <w:bookmarkStart w:id="3" w:name="Experience_1"/>
       <w:r>
         <w:rPr>
           <w:i/>
@@ -240,6 +216,7 @@
         </w:rPr>
         <w:t>Jan 2018 – Sep 2024</w:t>
       </w:r>
+      <w:bookmarkEnd w:id="3"/>
     </w:p>
     <w:p>
       <w:pPr>
@@ -283,7 +260,6 @@
         <w:ind w:left="426"/>
       </w:pPr>
       <w:r>
-        <w:lastRenderedPageBreak/>
         <w:t>Developed a framework that abstracted Kendo UI complexity, enabling frontend developers to use clean HTML with runtime enhancements.</w:t>
       </w:r>
     </w:p>
@@ -310,6 +286,7 @@
         <w:ind w:left="426"/>
       </w:pPr>
       <w:r>
+        <w:lastRenderedPageBreak/>
         <w:t>Managed Azure infrastructure: SQL, AD, networking, VMs, app registrations, and security groups.</w:t>
       </w:r>
     </w:p>
@@ -416,6 +393,7 @@
           <w:iCs/>
         </w:rPr>
       </w:pPr>
+      <w:bookmarkStart w:id="4" w:name="Experience_2"/>
       <w:r>
         <w:rPr>
           <w:i/>
@@ -453,6 +431,7 @@
         </w:rPr>
         <w:t>Jan 2017 – Jan 2018</w:t>
       </w:r>
+      <w:bookmarkEnd w:id="4"/>
     </w:p>
     <w:p>
       <w:pPr>
@@ -522,6 +501,7 @@
           <w:szCs w:val="28"/>
         </w:rPr>
       </w:pPr>
+      <w:bookmarkStart w:id="5" w:name="Experience_3"/>
       <w:r>
         <w:rPr>
           <w:i/>
@@ -558,6 +538,7 @@
         </w:rPr>
         <w:t>Jan 2017</w:t>
       </w:r>
+      <w:bookmarkEnd w:id="5"/>
     </w:p>
     <w:p>
       <w:pPr>
@@ -643,7 +624,6 @@
           <w:sz w:val="24"/>
           <w:szCs w:val="24"/>
         </w:rPr>
-        <w:lastRenderedPageBreak/>
         <w:t>Bank of Montreal – Toronto, ON</w:t>
       </w:r>
     </w:p>
@@ -689,6 +669,7 @@
         <w:ind w:left="426"/>
       </w:pPr>
       <w:r>
+        <w:lastRenderedPageBreak/>
         <w:t>Developed Silverlight, C#, and SQL-based applications for enterprise data management and operations.</w:t>
       </w:r>
     </w:p>
@@ -962,6 +943,7 @@
         </w:tabs>
         <w:ind w:left="426"/>
       </w:pPr>
+      <w:bookmarkStart w:id="6" w:name="Education"/>
       <w:r>
         <w:t>Web Design &amp; Computer Programming, Durham College</w:t>
       </w:r>
@@ -1005,6 +987,7 @@
       <w:r>
         <w:t xml:space="preserve"> C.V.I.</w:t>
       </w:r>
+      <w:bookmarkEnd w:id="6"/>
     </w:p>
     <w:sectPr>
       <w:pgSz w:w="12240" w:h="15840"/>
@@ -1171,7 +1154,7 @@
   <w:abstractNum w:abstractNumId="8" w15:restartNumberingAfterBreak="0">
     <w:nsid w:val="FFFFFF89"/>
     <w:multiLevelType w:val="singleLevel"/>
-    <w:tmpl w:val="36F6FF22"/>
+    <w:tmpl w:val="73F6220E"/>
     <w:lvl w:ilvl="0">
       <w:start w:val="1"/>
       <w:numFmt w:val="bullet"/>
@@ -1822,7 +1805,6 @@
   <w:style w:type="character" w:default="1" w:styleId="DefaultParagraphFont">
     <w:name w:val="Default Paragraph Font"/>
     <w:uiPriority w:val="1"/>
-    <w:semiHidden/>
     <w:unhideWhenUsed/>
   </w:style>
   <w:style w:type="table" w:default="1" w:styleId="TableNormal">

</xml_diff>

<commit_message>
Cleanup on output of resume for small llama model. Still working on the model rules as they aren't quite functioning correctly yet. Also updated bookmarks in the resume.
</commit_message>
<xml_diff>
--- a/CorporatePortfolio/DavidTurner_Resume.docx
+++ b/CorporatePortfolio/DavidTurner_Resume.docx
@@ -80,7 +80,7 @@
         </w:tabs>
         <w:ind w:left="426"/>
       </w:pPr>
-      <w:bookmarkStart w:id="2" w:name="Competencies"/>
+      <w:bookmarkStart w:id="2" w:name="Skills"/>
       <w:r>
         <w:t>Core Tech: C# .NET Core</w:t>
       </w:r>
@@ -617,6 +617,7 @@
         <w:pStyle w:val="Heading3"/>
         <w:spacing w:before="480"/>
       </w:pPr>
+      <w:bookmarkStart w:id="6" w:name="Experience_4"/>
       <w:r>
         <w:rPr>
           <w:i/>
@@ -647,6 +648,7 @@
         </w:rPr>
         <w:t>Sep 2011 – Mar 2015</w:t>
       </w:r>
+      <w:bookmarkEnd w:id="6"/>
     </w:p>
     <w:p>
       <w:pPr>
@@ -700,6 +702,7 @@
         <w:pStyle w:val="Heading3"/>
         <w:spacing w:before="480"/>
       </w:pPr>
+      <w:bookmarkStart w:id="7" w:name="Experience_5"/>
       <w:r>
         <w:rPr>
           <w:i/>
@@ -730,6 +733,7 @@
         </w:rPr>
         <w:t>Mar 2009 – Sep 2011</w:t>
       </w:r>
+      <w:bookmarkEnd w:id="7"/>
     </w:p>
     <w:p>
       <w:pPr>
@@ -798,6 +802,7 @@
         <w:pStyle w:val="Heading3"/>
         <w:spacing w:before="480"/>
       </w:pPr>
+      <w:bookmarkStart w:id="8" w:name="Experience_6"/>
       <w:r>
         <w:rPr>
           <w:i/>
@@ -889,6 +894,7 @@
         </w:rPr>
         <w:t>08</w:t>
       </w:r>
+      <w:bookmarkEnd w:id="8"/>
     </w:p>
     <w:p>
       <w:pPr>
@@ -943,29 +949,17 @@
         </w:tabs>
         <w:ind w:left="426"/>
       </w:pPr>
-      <w:bookmarkStart w:id="6" w:name="Education"/>
-      <w:r>
-        <w:t>Web Design &amp; Computer Programming, Durham College</w:t>
-      </w:r>
-    </w:p>
-    <w:p>
-      <w:pPr>
-        <w:pStyle w:val="ListBullet"/>
-        <w:tabs>
-          <w:tab w:val="clear" w:pos="7448"/>
-        </w:tabs>
-        <w:ind w:left="426"/>
-      </w:pPr>
-      <w:r>
-        <w:t xml:space="preserve">ALM &amp; Microsoft TFS, </w:t>
-      </w:r>
+      <w:bookmarkStart w:id="9" w:name="Education"/>
       <w:proofErr w:type="spellStart"/>
       <w:r>
         <w:t>ProTech</w:t>
       </w:r>
       <w:proofErr w:type="spellEnd"/>
       <w:r>
-        <w:t xml:space="preserve"> Training Services</w:t>
+        <w:t xml:space="preserve"> Training Services - </w:t>
+      </w:r>
+      <w:r>
+        <w:t>ALM &amp; Microsoft TFS</w:t>
       </w:r>
     </w:p>
     <w:p>
@@ -977,17 +971,41 @@
         <w:ind w:left="426"/>
       </w:pPr>
       <w:r>
-        <w:t xml:space="preserve">O.S.S.D., CCNA: Information Technology, </w:t>
+        <w:t xml:space="preserve">Durham College - </w:t>
       </w:r>
+      <w:r>
+        <w:t>Web Design &amp; Computer Programming</w:t>
+      </w:r>
+    </w:p>
+    <w:p>
+      <w:pPr>
+        <w:pStyle w:val="ListBullet"/>
+        <w:tabs>
+          <w:tab w:val="clear" w:pos="7448"/>
+        </w:tabs>
+        <w:ind w:left="426"/>
+      </w:pPr>
       <w:proofErr w:type="spellStart"/>
       <w:r>
         <w:t>Eastdale</w:t>
       </w:r>
       <w:proofErr w:type="spellEnd"/>
       <w:r>
-        <w:t xml:space="preserve"> C.V.I.</w:t>
+        <w:t xml:space="preserve"> C.V.I - </w:t>
       </w:r>
-      <w:bookmarkEnd w:id="6"/>
+      <w:r>
+        <w:t>Information Technology</w:t>
+      </w:r>
+      <w:r>
+        <w:t xml:space="preserve"> -</w:t>
+      </w:r>
+      <w:r>
+        <w:t xml:space="preserve"> </w:t>
+      </w:r>
+      <w:r>
+        <w:t>O.S.S.D., CCNA</w:t>
+      </w:r>
+      <w:bookmarkEnd w:id="9"/>
     </w:p>
     <w:sectPr>
       <w:pgSz w:w="12240" w:h="15840"/>
@@ -1805,6 +1823,7 @@
   <w:style w:type="character" w:default="1" w:styleId="DefaultParagraphFont">
     <w:name w:val="Default Paragraph Font"/>
     <w:uiPriority w:val="1"/>
+    <w:semiHidden/>
     <w:unhideWhenUsed/>
   </w:style>
   <w:style w:type="table" w:default="1" w:styleId="TableNormal">

</xml_diff>

<commit_message>
This is the closest I've been to getting this AI to respond exactly in the manor that I want using llama3.2. There are some UI issues still but will be resolving those shortly.
</commit_message>
<xml_diff>
--- a/CorporatePortfolio/DavidTurner_Resume.docx
+++ b/CorporatePortfolio/DavidTurner_Resume.docx
@@ -10,7 +10,7 @@
           <w:szCs w:val="32"/>
         </w:rPr>
       </w:pPr>
-      <w:bookmarkStart w:id="0" w:name="ContactInfo"/>
+      <w:bookmarkStart w:id="0" w:name="Contact_Info"/>
       <w:r>
         <w:rPr>
           <w:sz w:val="36"/>
@@ -80,7 +80,7 @@
         </w:tabs>
         <w:ind w:left="426"/>
       </w:pPr>
-      <w:bookmarkStart w:id="2" w:name="Skills"/>
+      <w:bookmarkStart w:id="2" w:name="Competencies"/>
       <w:r>
         <w:t>Core Tech: C# .NET Core</w:t>
       </w:r>
@@ -949,7 +949,21 @@
         </w:tabs>
         <w:ind w:left="426"/>
       </w:pPr>
-      <w:bookmarkStart w:id="9" w:name="Education"/>
+      <w:r>
+        <w:t xml:space="preserve">Durham College - </w:t>
+      </w:r>
+      <w:r>
+        <w:t xml:space="preserve">Web Design &amp; Computer Programming, </w:t>
+      </w:r>
+    </w:p>
+    <w:p>
+      <w:pPr>
+        <w:pStyle w:val="ListBullet"/>
+        <w:tabs>
+          <w:tab w:val="clear" w:pos="7448"/>
+        </w:tabs>
+        <w:ind w:left="426"/>
+      </w:pPr>
       <w:proofErr w:type="spellStart"/>
       <w:r>
         <w:t>ProTech</w:t>
@@ -970,42 +984,31 @@
         </w:tabs>
         <w:ind w:left="426"/>
       </w:pPr>
-      <w:r>
-        <w:t xml:space="preserve">Durham College - </w:t>
-      </w:r>
-      <w:r>
-        <w:t>Web Design &amp; Computer Programming</w:t>
-      </w:r>
-    </w:p>
-    <w:p>
-      <w:pPr>
-        <w:pStyle w:val="ListBullet"/>
-        <w:tabs>
-          <w:tab w:val="clear" w:pos="7448"/>
-        </w:tabs>
-        <w:ind w:left="426"/>
-      </w:pPr>
       <w:proofErr w:type="spellStart"/>
       <w:r>
         <w:t>Eastdale</w:t>
       </w:r>
       <w:proofErr w:type="spellEnd"/>
       <w:r>
-        <w:t xml:space="preserve"> C.V.I - </w:t>
+        <w:t xml:space="preserve"> C.V.I. -</w:t>
       </w:r>
       <w:r>
-        <w:t>Information Technology</w:t>
+        <w:t xml:space="preserve"> Information </w:t>
+      </w:r>
+      <w:proofErr w:type="gramStart"/>
+      <w:r>
+        <w:t>Technology</w:t>
       </w:r>
       <w:r>
-        <w:t xml:space="preserve"> -</w:t>
+        <w:t xml:space="preserve"> :</w:t>
       </w:r>
+      <w:proofErr w:type="gramEnd"/>
       <w:r>
         <w:t xml:space="preserve"> </w:t>
       </w:r>
       <w:r>
         <w:t>O.S.S.D., CCNA</w:t>
       </w:r>
-      <w:bookmarkEnd w:id="9"/>
     </w:p>
     <w:sectPr>
       <w:pgSz w:w="12240" w:h="15840"/>

</xml_diff>

<commit_message>
All changes implemented to include the project list in the chatbot output from the resume.
</commit_message>
<xml_diff>
--- a/CorporatePortfolio/DavidTurner_Resume.docx
+++ b/CorporatePortfolio/DavidTurner_Resume.docx
@@ -87,8 +87,13 @@
         <w:t xml:space="preserve">, SQL, </w:t>
       </w:r>
       <w:r>
-        <w:t>TypeScript, ASP.NET Core, MVC, Entity Framework, Angular, SignalR</w:t>
+        <w:t xml:space="preserve">TypeScript, ASP.NET Core, MVC, Entity Framework, Angular, </w:t>
       </w:r>
+      <w:proofErr w:type="spellStart"/>
+      <w:r>
+        <w:t>SignalR</w:t>
+      </w:r>
+      <w:proofErr w:type="spellEnd"/>
     </w:p>
     <w:p>
       <w:pPr>
@@ -122,7 +127,23 @@
         <w:t xml:space="preserve">Enterprise &amp; Tools: </w:t>
       </w:r>
       <w:r>
-        <w:t>SmartSimple CRM, CRM Dynamics, Active Directory, ADFS, SCCM, Visual Studio, Selenium, xUnit/nUnit, MS Test</w:t>
+        <w:t xml:space="preserve">SmartSimple CRM, CRM Dynamics, Active Directory, ADFS, SCCM, Visual Studio, Selenium, </w:t>
+      </w:r>
+      <w:proofErr w:type="spellStart"/>
+      <w:r>
+        <w:t>xUnit</w:t>
+      </w:r>
+      <w:proofErr w:type="spellEnd"/>
+      <w:r>
+        <w:t>/</w:t>
+      </w:r>
+      <w:proofErr w:type="spellStart"/>
+      <w:r>
+        <w:t>nUnit</w:t>
+      </w:r>
+      <w:proofErr w:type="spellEnd"/>
+      <w:r>
+        <w:t>, MS Test</w:t>
       </w:r>
     </w:p>
     <w:p>
@@ -141,13 +162,7 @@
         <w:t>Agile/Scrum, TDD, SDLC, Code Reviews, Design Patterns, Kendo UI, jQuery, Responsive UI</w:t>
       </w:r>
       <w:r>
-        <w:t xml:space="preserve">, </w:t>
-      </w:r>
-      <w:r>
-        <w:t xml:space="preserve">Razor, Blazor, Angular 2.0, AngularJS, JavaScript, </w:t>
-      </w:r>
-      <w:r>
-        <w:t>CSS</w:t>
+        <w:t>, Razor, Blazor, Angular 2.0, AngularJS, JavaScript, CSS</w:t>
       </w:r>
     </w:p>
     <w:p>
@@ -160,7 +175,15 @@
         <w:ind w:left="426"/>
       </w:pPr>
       <w:r>
-        <w:t>Operating Systems: Windows (All Versions), Linux (Ubuntu, Fedora, Redhat, Kali)</w:t>
+        <w:t xml:space="preserve">Operating Systems: Windows (All Versions), Linux (Ubuntu, Fedora, </w:t>
+      </w:r>
+      <w:proofErr w:type="spellStart"/>
+      <w:r>
+        <w:t>Redhat</w:t>
+      </w:r>
+      <w:proofErr w:type="spellEnd"/>
+      <w:r>
+        <w:t>, Kali)</w:t>
       </w:r>
     </w:p>
     <w:p>
@@ -179,7 +202,35 @@
         <w:rPr>
           <w:lang w:val="es-ES"/>
         </w:rPr>
-        <w:t>AI Components: Ollama, Groq, Lla</w:t>
+        <w:t xml:space="preserve">AI </w:t>
+      </w:r>
+      <w:proofErr w:type="spellStart"/>
+      <w:r>
+        <w:rPr>
+          <w:lang w:val="es-ES"/>
+        </w:rPr>
+        <w:t>Components</w:t>
+      </w:r>
+      <w:proofErr w:type="spellEnd"/>
+      <w:r>
+        <w:rPr>
+          <w:lang w:val="es-ES"/>
+        </w:rPr>
+        <w:t xml:space="preserve">: Ollama, </w:t>
+      </w:r>
+      <w:proofErr w:type="spellStart"/>
+      <w:r>
+        <w:rPr>
+          <w:lang w:val="es-ES"/>
+        </w:rPr>
+        <w:t>Groq</w:t>
+      </w:r>
+      <w:proofErr w:type="spellEnd"/>
+      <w:r>
+        <w:rPr>
+          <w:lang w:val="es-ES"/>
+        </w:rPr>
+        <w:t>, Lla</w:t>
       </w:r>
       <w:r>
         <w:rPr>
@@ -778,9 +829,19 @@
       <w:r>
         <w:t xml:space="preserve">Reverse engineered </w:t>
       </w:r>
+      <w:proofErr w:type="spellStart"/>
       <w:r>
-        <w:t>PsTools by Sysinternals</w:t>
+        <w:t>PsTools</w:t>
       </w:r>
+      <w:proofErr w:type="spellEnd"/>
+      <w:r>
+        <w:t xml:space="preserve"> by </w:t>
+      </w:r>
+      <w:proofErr w:type="spellStart"/>
+      <w:r>
+        <w:t>Sysinternals</w:t>
+      </w:r>
+      <w:proofErr w:type="spellEnd"/>
       <w:r>
         <w:t xml:space="preserve"> to create graphical remote process managers for help desk efficiency.</w:t>
       </w:r>
@@ -947,7 +1008,6 @@
         <w:pStyle w:val="Heading2"/>
         <w:spacing w:before="480" w:after="120"/>
       </w:pPr>
-      <w:bookmarkStart w:id="9" w:name="Projects"/>
       <w:r>
         <w:t>Independent Projects</w:t>
       </w:r>
@@ -958,6 +1018,7 @@
         <w:spacing w:before="0"/>
         <w:ind w:left="227" w:hanging="227"/>
       </w:pPr>
+      <w:bookmarkStart w:id="9" w:name="Project_1"/>
       <w:r>
         <w:t>Generative AI Chatbot Integration | May 2026</w:t>
       </w:r>
@@ -1025,6 +1086,7 @@
         </w:rPr>
         <w:t xml:space="preserve">Engineered a modular provider system to toggle between a local </w:t>
       </w:r>
+      <w:proofErr w:type="spellStart"/>
       <w:r>
         <w:rPr>
           <w:b/>
@@ -1033,19 +1095,30 @@
         </w:rPr>
         <w:t>Ollama</w:t>
       </w:r>
+      <w:proofErr w:type="spellEnd"/>
       <w:r>
         <w:rPr>
           <w:lang w:val="en-CA"/>
         </w:rPr>
         <w:t xml:space="preserve"> instance (Llama 3.2) for private development and </w:t>
       </w:r>
+      <w:proofErr w:type="spellStart"/>
       <w:r>
         <w:rPr>
           <w:b/>
           <w:bCs/>
           <w:lang w:val="en-CA"/>
         </w:rPr>
-        <w:t>Groq’s LPU</w:t>
+        <w:t>Groq’s</w:t>
+      </w:r>
+      <w:proofErr w:type="spellEnd"/>
+      <w:r>
+        <w:rPr>
+          <w:b/>
+          <w:bCs/>
+          <w:lang w:val="en-CA"/>
+        </w:rPr>
+        <w:t xml:space="preserve"> LPU</w:t>
       </w:r>
       <w:r>
         <w:rPr>
@@ -1071,6 +1144,7 @@
         </w:rPr>
         <w:t>Implemented real-time streaming responses in C# Razor components using asynchronous iterators (</w:t>
       </w:r>
+      <w:proofErr w:type="spellStart"/>
       <w:r>
         <w:rPr>
           <w:b/>
@@ -1079,6 +1153,7 @@
         </w:rPr>
         <w:t>IAsyncEnumerable</w:t>
       </w:r>
+      <w:proofErr w:type="spellEnd"/>
       <w:r>
         <w:rPr>
           <w:lang w:val="en-CA"/>
@@ -1191,8 +1266,13 @@
         </w:tabs>
         <w:ind w:left="426"/>
       </w:pPr>
+      <w:proofErr w:type="spellStart"/>
       <w:r>
-        <w:t xml:space="preserve">ProTech Training Services - </w:t>
+        <w:t>ProTech</w:t>
+      </w:r>
+      <w:proofErr w:type="spellEnd"/>
+      <w:r>
+        <w:t xml:space="preserve"> Training Services - </w:t>
       </w:r>
       <w:r>
         <w:t>ALM &amp; Microsoft TFS</w:t>
@@ -1206,15 +1286,25 @@
         </w:tabs>
         <w:ind w:left="426"/>
       </w:pPr>
+      <w:proofErr w:type="spellStart"/>
       <w:r>
-        <w:t>Eastdale C.V.I. -</w:t>
+        <w:t>Eastdale</w:t>
+      </w:r>
+      <w:proofErr w:type="spellEnd"/>
+      <w:r>
+        <w:t xml:space="preserve"> C.V.I. -</w:t>
       </w:r>
       <w:r>
-        <w:t xml:space="preserve"> Information Technology</w:t>
+        <w:t xml:space="preserve"> Information </w:t>
+      </w:r>
+      <w:proofErr w:type="gramStart"/>
+      <w:r>
+        <w:t>Technology</w:t>
       </w:r>
       <w:r>
         <w:t xml:space="preserve"> :</w:t>
       </w:r>
+      <w:proofErr w:type="gramEnd"/>
       <w:r>
         <w:t xml:space="preserve"> </w:t>
       </w:r>
@@ -1387,7 +1477,7 @@
   <w:abstractNum w:abstractNumId="8" w15:restartNumberingAfterBreak="0">
     <w:nsid w:val="FFFFFF89"/>
     <w:multiLevelType w:val="singleLevel"/>
-    <w:tmpl w:val="16EE1C2A"/>
+    <w:tmpl w:val="1FEE40D2"/>
     <w:lvl w:ilvl="0">
       <w:start w:val="1"/>
       <w:numFmt w:val="bullet"/>
@@ -2196,6 +2286,7 @@
   <w:style w:type="character" w:default="1" w:styleId="DefaultParagraphFont">
     <w:name w:val="Default Paragraph Font"/>
     <w:uiPriority w:val="1"/>
+    <w:semiHidden/>
     <w:unhideWhenUsed/>
   </w:style>
   <w:style w:type="table" w:default="1" w:styleId="TableNormal">

</xml_diff>

<commit_message>
Updates for projects on main page and small visual tweaks. Resume updated with project and link.
</commit_message>
<xml_diff>
--- a/CorporatePortfolio/DavidTurner_Resume.docx
+++ b/CorporatePortfolio/DavidTurner_Resume.docx
@@ -349,7 +349,6 @@
         <w:ind w:left="426"/>
       </w:pPr>
       <w:r>
-        <w:lastRenderedPageBreak/>
         <w:t>Led CI/CD initiatives using Azure DevOps, YAML pipelines, and PowerShell scripting to optimize release management.</w:t>
       </w:r>
     </w:p>
@@ -363,6 +362,7 @@
         <w:ind w:left="426"/>
       </w:pPr>
       <w:r>
+        <w:lastRenderedPageBreak/>
         <w:t>Managed Azure infrastructure: SQL, AD, networking, VMs, app registrations, and security groups.</w:t>
       </w:r>
     </w:p>
@@ -1022,6 +1022,18 @@
       <w:r>
         <w:t>Generative AI Chatbot Integration | May 2026</w:t>
       </w:r>
+      <w:r>
+        <w:t xml:space="preserve"> | </w:t>
+      </w:r>
+      <w:r>
+        <w:t>https:/</w:t>
+      </w:r>
+      <w:r>
+        <w:t>/github.com/dave-w-turner/BlazorPortfolio</w:t>
+      </w:r>
+      <w:r>
+        <w:t xml:space="preserve"> </w:t>
+      </w:r>
     </w:p>
     <w:p>
       <w:pPr>
@@ -1173,7 +1185,6 @@
         <w:rPr>
           <w:lang w:val="en-CA"/>
         </w:rPr>
-        <w:lastRenderedPageBreak/>
         <w:t xml:space="preserve">Managed the full project lifecycle using </w:t>
       </w:r>
       <w:r>
@@ -1240,6 +1251,7 @@
         <w:spacing w:before="480" w:after="120"/>
       </w:pPr>
       <w:r>
+        <w:lastRenderedPageBreak/>
         <w:t>Education &amp; Training</w:t>
       </w:r>
     </w:p>
@@ -1314,7 +1326,7 @@
     </w:p>
     <w:sectPr>
       <w:pgSz w:w="12240" w:h="15840"/>
-      <w:pgMar w:top="1276" w:right="1800" w:bottom="993" w:left="1800" w:header="720" w:footer="720" w:gutter="0"/>
+      <w:pgMar w:top="1276" w:right="1325" w:bottom="993" w:left="1800" w:header="720" w:footer="720" w:gutter="0"/>
       <w:cols w:space="720"/>
       <w:docGrid w:linePitch="360"/>
     </w:sectPr>

</xml_diff>